<commit_message>
feat: 为 Word 模板新增4个事实和理由章节变量（accidentFacts/liabilityDetermination/insuranceStatus/otherFacts），共22个占位符
</commit_message>
<xml_diff>
--- a/skills/templates/traffic_accident_with_vars.docx
+++ b/skills/templates/traffic_accident_with_vars.docx
@@ -2050,6 +2050,13 @@
                 <w:lang w:eastAsia="zh"/>
               </w:rPr>
             </w:pPr>
+            <w:r>
+              <w:rPr>
+                <w:sz w:val="21"/>
+                <w:szCs w:val="21"/>
+              </w:rPr>
+              <w:t>{{accidentFacts}}</w:t>
+            </w:r>
           </w:p>
         </w:tc>
       </w:tr>
@@ -2094,6 +2101,13 @@
                 <w:szCs w:val="28"/>
               </w:rPr>
             </w:pPr>
+            <w:r>
+              <w:rPr>
+                <w:sz w:val="21"/>
+                <w:szCs w:val="21"/>
+              </w:rPr>
+              <w:t>{{liabilityDetermination}}</w:t>
+            </w:r>
           </w:p>
         </w:tc>
       </w:tr>
@@ -2140,6 +2154,13 @@
                 <w:lang w:eastAsia="zh"/>
               </w:rPr>
             </w:pPr>
+            <w:r>
+              <w:rPr>
+                <w:sz w:val="21"/>
+                <w:szCs w:val="21"/>
+              </w:rPr>
+              <w:t>{{insuranceStatus}}</w:t>
+            </w:r>
           </w:p>
         </w:tc>
       </w:tr>
@@ -2186,6 +2207,13 @@
                 <w:lang w:eastAsia="zh"/>
               </w:rPr>
             </w:pPr>
+            <w:r>
+              <w:rPr>
+                <w:sz w:val="21"/>
+                <w:szCs w:val="21"/>
+              </w:rPr>
+              <w:t>{{otherFacts}}</w:t>
+            </w:r>
           </w:p>
         </w:tc>
       </w:tr>

</xml_diff>